<commit_message>
Thrust Stand guides v8/PTv6: supplier links added to BOM table
</commit_message>
<xml_diff>
--- a/ion-wind-plane/Thrust_Stand_Guide_PT_v6.docx
+++ b/ion-wind-plane/Thrust_Stand_Guide_PT_v6.docx
@@ -602,9 +602,15 @@
             <w:tcW w:type="dxa" w:w="2880"/>
           </w:tcPr>
           <w:p>
-            <w:r>
-              <w:t>reichelt.de / Amazon</w:t>
-            </w:r>
+            <w:r/>
+            <w:hyperlink r:id="rId28">
+              <w:r>
+                <w:rPr>
+                  <w:rStyle w:val="Hyperlink"/>
+                </w:rPr>
+                <w:t>reichelt.de — Modulo ZVS</w:t>
+              </w:r>
+            </w:hyperlink>
           </w:p>
         </w:tc>
         <w:tc>
@@ -634,9 +640,15 @@
             <w:tcW w:type="dxa" w:w="2880"/>
           </w:tcPr>
           <w:p>
-            <w:r>
-              <w:t>reichelt.de</w:t>
-            </w:r>
+            <w:r/>
+            <w:hyperlink r:id="rId29">
+              <w:r>
+                <w:rPr>
+                  <w:rStyle w:val="Hyperlink"/>
+                </w:rPr>
+                <w:t>reichelt.de — Arduino Nano Every</w:t>
+              </w:r>
+            </w:hyperlink>
           </w:p>
         </w:tc>
         <w:tc>
@@ -698,9 +710,15 @@
             <w:tcW w:type="dxa" w:w="2880"/>
           </w:tcPr>
           <w:p>
-            <w:r>
-              <w:t>Amazon.de</w:t>
-            </w:r>
+            <w:r/>
+            <w:hyperlink r:id="rId30">
+              <w:r>
+                <w:rPr>
+                  <w:rStyle w:val="Hyperlink"/>
+                </w:rPr>
+                <w:t>Amazon.de — Foil Cobre 0.05mm</w:t>
+              </w:r>
+            </w:hyperlink>
           </w:p>
         </w:tc>
         <w:tc>
@@ -730,9 +748,15 @@
             <w:tcW w:type="dxa" w:w="2880"/>
           </w:tcPr>
           <w:p>
-            <w:r>
-              <w:t>Amazon.de / OBI</w:t>
-            </w:r>
+            <w:r/>
+            <w:hyperlink r:id="rId31">
+              <w:r>
+                <w:rPr>
+                  <w:rStyle w:val="Hyperlink"/>
+                </w:rPr>
+                <w:t>Amazon.de — Acrylic 3mm</w:t>
+              </w:r>
+            </w:hyperlink>
           </w:p>
         </w:tc>
         <w:tc>
@@ -762,9 +786,15 @@
             <w:tcW w:type="dxa" w:w="2880"/>
           </w:tcPr>
           <w:p>
-            <w:r>
-              <w:t>Amazon.de</w:t>
-            </w:r>
+            <w:r/>
+            <w:hyperlink r:id="rId32">
+              <w:r>
+                <w:rPr>
+                  <w:rStyle w:val="Hyperlink"/>
+                </w:rPr>
+                <w:t>Amazon.de — Barra Roscada M3</w:t>
+              </w:r>
+            </w:hyperlink>
           </w:p>
         </w:tc>
         <w:tc>
@@ -794,9 +824,15 @@
             <w:tcW w:type="dxa" w:w="2880"/>
           </w:tcPr>
           <w:p>
-            <w:r>
-              <w:t>Amazon.de</w:t>
-            </w:r>
+            <w:r/>
+            <w:hyperlink r:id="rId33">
+              <w:r>
+                <w:rPr>
+                  <w:rStyle w:val="Hyperlink"/>
+                </w:rPr>
+                <w:t>Amazon.de — HX711 + Load Cell</w:t>
+              </w:r>
+            </w:hyperlink>
           </w:p>
         </w:tc>
         <w:tc>
@@ -858,9 +894,15 @@
             <w:tcW w:type="dxa" w:w="2880"/>
           </w:tcPr>
           <w:p>
-            <w:r>
-              <w:t>Amazon.de</w:t>
-            </w:r>
+            <w:r/>
+            <w:hyperlink r:id="rId34">
+              <w:r>
+                <w:rPr>
+                  <w:rStyle w:val="Hyperlink"/>
+                </w:rPr>
+                <w:t>Amazon.de — Suporte 18650</w:t>
+              </w:r>
+            </w:hyperlink>
           </w:p>
         </w:tc>
         <w:tc>
@@ -890,9 +932,15 @@
             <w:tcW w:type="dxa" w:w="2880"/>
           </w:tcPr>
           <w:p>
-            <w:r>
-              <w:t>Supermercado</w:t>
-            </w:r>
+            <w:r/>
+            <w:hyperlink r:id="rId35">
+              <w:r>
+                <w:rPr>
+                  <w:rStyle w:val="Hyperlink"/>
+                </w:rPr>
+                <w:t>Amazon.de — Palha de Aco</w:t>
+              </w:r>
+            </w:hyperlink>
           </w:p>
         </w:tc>
         <w:tc>

</xml_diff>

<commit_message>
Thrust Stand guides: rewritten step text (IKEA-style clarity) with What You Need + Actions
</commit_message>
<xml_diff>
--- a/ion-wind-plane/Thrust_Stand_Guide_PT_v6.docx
+++ b/ion-wind-plane/Thrust_Stand_Guide_PT_v6.docx
@@ -1294,17 +1294,19 @@
     <w:p/>
     <w:p>
       <w:r>
-        <w:t>INPUT: 2 terminais pequenos — GND (terra) e VCC (5-12V positivo)</w:t>
+        <w:t xml:space="preserve">O que precisas: O Modulo ZVS Flyback.
+Acao 1: Localiza os dois terminais pequenos na placa. Estes sao os teus inputs de alimentacao. Identifica as etiquetas "GND" (Terra) e "VCC" (5-12V Positivo).
+Acao 2: Localiza os dois terminais grandes. Estas sao as tuas saidas de Alta Tensao (HV), etiquetadas "HV+" e "HV-".</w:t>
       </w:r>
     </w:p>
     <w:p>
       <w:r>
-        <w:t>OUTPUT HV: 2 terminais grossos — HV+ e HV-</w:t>
+        <w:t xml:space="preserve">Verificacao de Seguranca: Nunca toques nos fios HV enquanto o dispositivo estiver ligado!</w:t>
       </w:r>
     </w:p>
     <w:p>
       <w:r>
-        <w:t>Os fios HV vao directamente aos electrodos — NAO tocar quando ligado!</w:t>
+        <w:t xml:space="preserve"/>
       </w:r>
     </w:p>
     <w:p>
@@ -1369,22 +1371,26 @@
     <w:p/>
     <w:p>
       <w:r>
-        <w:t>1. Liga VCC ZVS ao positivo fonte (vermelho suporte 18650)</w:t>
+        <w:t xml:space="preserve">O que precisas: Fonte de alimentacao (5-12V DC, 2A minimo), fios de ligacao.
+Acao 1: Liga um fio do terminal "VCC" do ZVS ao terminal positivo (+) da tua fonte de alimentacao.
+Acao 2: Liga um fio do terminal "GND" do ZVS ao terminal negativo/terra (-) da tua fonte de alimentacao.
+Acao 3: Liga a fonte de alimentacao.</w:t>
       </w:r>
     </w:p>
     <w:p>
       <w:r>
-        <w:t>2. Liga GND ZVS ao negativo fonte (preto)</w:t>
+        <w:t xml:space="preserve">Verificacao: Ouve um zumbido agudo. Se o ouvires, o modulo esta a funcionar correctamente.
+Aviso: Toca no modulo. Se aquecer acima de 50C, desliga-o imediatamente e verifica as ligacoes.</w:t>
       </w:r>
     </w:p>
     <w:p>
       <w:r>
-        <w:t>3. Liga fonte — zumbido agudo = a funcionar</w:t>
+        <w:t xml:space="preserve"/>
       </w:r>
     </w:p>
     <w:p>
       <w:r>
-        <w:t>4. Se aquecer &gt;50C, desliga — verifica polaridade</w:t>
+        <w:t xml:space="preserve"/>
       </w:r>
     </w:p>
     <w:p>
@@ -1449,22 +1455,26 @@
     <w:p/>
     <w:p>
       <w:r>
-        <w:t>1. Corta acrylic: 2x 15cmx3cm (montantes) + 2x 20cmx3cm (base/topo)</w:t>
+        <w:t xml:space="preserve">O que precisas: Folhas de acrylic 3mm, parafusos M3, porcas M3.
+Acao 1: Corta dois pedaços iguais de acrylic medindo 15cm x 3cm. Estes serao os teus montante lateral esquerdo e direito.
+Acao 2: Corta mais dois pedaços de acrylic medindo 20cm x 3cm. Estes serao as pecas superior e da base.
+Acao 3: Faz quatro furos de 3mm em cada um dos montante laterais de 15cm.
+Acao 4: Monta as pecas usando parafusos M3 nesta ordem exacta: Peca da base -&gt; Montante esquerdo -&gt; Espacadores -&gt; Montante direito -&gt; Peca da base.</w:t>
       </w:r>
     </w:p>
     <w:p>
       <w:r>
-        <w:t>2. Faz 4 furos 3mm em cada montante (M3)</w:t>
+        <w:t xml:space="preserve">Verificacao: Apert bem os parafusos M3 mas NAO os apertes demasiado, pois vais precisar de ajustar o gap mais tarde.</w:t>
       </w:r>
     </w:p>
     <w:p>
       <w:r>
-        <w:t>3. Monta sandwich: base + montante esquerdo + espacadores + montante direito + base</w:t>
+        <w:t xml:space="preserve"/>
       </w:r>
     </w:p>
     <w:p>
       <w:r>
-        <w:t>4. NAO apertar demasiado — gap ajustavel</w:t>
+        <w:t xml:space="preserve"/>
       </w:r>
     </w:p>
     <w:p>
@@ -1529,22 +1539,26 @@
     <w:p/>
     <w:p>
       <w:r>
-        <w:t>1. Passa fio 0.1mm entre montants, a meio da estrutura</w:t>
+        <w:t xml:space="preserve">O que precisas: Fio de stainless steel 0.1mm, fita isoladora.
+Acao 1: Passa o fio de stainless steel 0.1mm exactamente pelo centro dos dois montante laterais.
+Acao 2: Puxa o fio com forca ate ficar tenso como a corda de uma guitarra. Nao puxas ao ponto de partir.
+Acao 3: Assegura que o fio esta completamente direito e nao toca em nenhuma outra parte da estrutura.
+Acao 4: Fixas as pontas do fio com fita isoladora na parte exterior dos montante.</w:t>
       </w:r>
     </w:p>
     <w:p>
       <w:r>
-        <w:t>2. Estica ate ficar tenso como corda de guitarra — mas nao ao ponto de partir</w:t>
+        <w:t xml:space="preserve"/>
       </w:r>
     </w:p>
     <w:p>
       <w:r>
-        <w:t>3. Fio nao pode tocar em nada, completamente esticado e direito</w:t>
+        <w:t xml:space="preserve"/>
       </w:r>
     </w:p>
     <w:p>
       <w:r>
-        <w:t>4. Fixa com fita isoladora nas pontas</w:t>
+        <w:t xml:space="preserve"/>
       </w:r>
     </w:p>
     <w:p>
@@ -1609,22 +1623,26 @@
     <w:p/>
     <w:p>
       <w:r>
-        <w:t>1. Corta tira cobre/aluminio ~2cm x 15cm</w:t>
+        <w:t xml:space="preserve">Para Opcao A (Aerofolio Padrao):
+Acao 1: Corta um pedaco de foil de cobre ou aluminio num strip de aproximadamente 2cm de largura e 15cm de comprimento.
+Acao 2: Embrulha este strip de foil a volta de um tubo cilindrico para criar uma forma curva de aerofolio.
+Acao 3: Monta este collector curvo directamente paralelo ao fio emitter fin.
+Acao 4: Define a distancia inicial entre o fio emitter e o collector para 20mm.</w:t>
       </w:r>
     </w:p>
     <w:p>
       <w:r>
-        <w:t>2. Moldeia a volta de tubo para forma de aerofolio</w:t>
+        <w:t xml:space="preserve"/>
       </w:r>
     </w:p>
     <w:p>
       <w:r>
-        <w:t>3. Coloca collector paralelo ao fio emitter</w:t>
+        <w:t xml:space="preserve"/>
       </w:r>
     </w:p>
     <w:p>
       <w:r>
-        <w:t>4. Gap: 20mm inicial</w:t>
+        <w:t xml:space="preserve"/>
       </w:r>
     </w:p>
     <w:p>
@@ -1689,32 +1707,36 @@
     <w:p/>
     <w:p>
       <w:r>
-        <w:t>1. Corta malha aluminum ~5cm x 50cm (tela mosquito)</w:t>
+        <w:t xml:space="preserve">Para Opcao C (Upgrade Steel Wool):
+Acao 1: Corta um strip de malha de aluminum de 5cm x 50cm (semelhante a rede de mosquito).
+Acao 2: Estica esta malha sobre a estrutura de acrylic para ficar plana mas mantendo a textura irregular.
+Acao 3: Coloca um pedaco de palha de aco #0000 directamente POR CIMA da malha.
+Acao 4: Liga a combinacao malha + palha de aco ao fio HV- (negativo/catodo).</w:t>
       </w:r>
     </w:p>
     <w:p>
       <w:r>
-        <w:t>2. Estica malha sobre acrylic — fica plana com textura</w:t>
+        <w:t xml:space="preserve">Nota: A textura 3D desta configuracao aumenta o thrust em aproximadamente 1.8 vezes. Define o gap para 20mm.</w:t>
       </w:r>
     </w:p>
     <w:p>
       <w:r>
-        <w:t>3. Coloca palha de aco #0000 POR CIMA da malha</w:t>
+        <w:t xml:space="preserve"/>
       </w:r>
     </w:p>
     <w:p>
       <w:r>
-        <w:t>4. Liga malha+steel wool ao fio HV- (terra/catodo)</w:t>
+        <w:t xml:space="preserve"/>
       </w:r>
     </w:p>
     <w:p>
       <w:r>
-        <w:t>5. Textura 3D = ~1.8x mais thrust</w:t>
+        <w:t xml:space="preserve"/>
       </w:r>
     </w:p>
     <w:p>
       <w:r>
-        <w:t>6. Gap: 20mm (mesmo seguro que Opcao A)</w:t>
+        <w:t xml:space="preserve"/>
       </w:r>
     </w:p>
     <w:p>
@@ -1779,22 +1801,25 @@
     <w:p/>
     <w:p>
       <w:r>
-        <w:t>1. Usa régua/paquimetro para medir gap</w:t>
+        <w:t xml:space="preserve">O que precisas: Regua ou paquimetro.
+Acao 1: Toma uma regua ou paquimetro e mede a distancia do gap entre o fio emitter e o collector.
+Verificacao: Assegura que o gap e exatamente 20mm, que e a distancia otima para 35kV.
+Aviso: Se o gap for menor que 15mm, o sistema vai produzir faíscas brilhantes (arcing). Se o gap for maior que 40mm, o thrust sera muito fraco.</w:t>
       </w:r>
     </w:p>
     <w:p>
       <w:r>
-        <w:t>2. Gap &lt; 15mm = ARKING (faíscas)</w:t>
+        <w:t xml:space="preserve">CORRETO: Brilho violeta suave à volta do fio. ERRADO: Faíscas brilhantes = aumenta o gap imediatamente!</w:t>
       </w:r>
     </w:p>
     <w:p>
       <w:r>
-        <w:t>3. Gap &gt; 40mm = thrust muito fraco</w:t>
+        <w:t xml:space="preserve"/>
       </w:r>
     </w:p>
     <w:p>
       <w:r>
-        <w:t>4. 20mm = ponto optimo para comecar a 35kV</w:t>
+        <w:t xml:space="preserve"/>
       </w:r>
     </w:p>
     <w:p>
@@ -1802,7 +1827,7 @@
         <w:pStyle w:val="Heading2"/>
       </w:pPr>
       <w:r>
-        <w:t>PASSO 7: Ligar fios HV</w:t>
+        <w:t xml:space="preserve"/>
       </w:r>
     </w:p>
     <w:p>
@@ -1859,17 +1884,20 @@
     <w:p/>
     <w:p>
       <w:r>
-        <w:t>1. HV+ (ZVS) → fio emitter (anodo/positivo)</w:t>
+        <w:t xml:space="preserve">O que precisas: Fio de cobre flexivel, ferro de soldar.
+Acao 1: Liga o fio HV+ do ZVS ao fio emitter fin (este e o anodo/electrodo positivo).
+Acao 2: Liga o fio HV- do ZVS ao collector foil (este e o catodo/electrodo negativo).
+Acao 3: Assegura que cada ligacao esta limpa e bem soldada. Uma soldadura mal feita cria um ponto quente e causa arcing.</w:t>
       </w:r>
     </w:p>
     <w:p>
       <w:r>
-        <w:t>2. HV- (ZVS) → collector foil (catodo/negativo)</w:t>
+        <w:t xml:space="preserve">Verificacao de Seguranca: Faz todas as ligacoes antes de ligar a alimentacao. Nunca toques nos fios enquanto o sistema estiver em funcionamento.</w:t>
       </w:r>
     </w:p>
     <w:p>
       <w:r>
-        <w:t>3. Usa fio cobre flexivel, boa soldadura</w:t>
+        <w:t xml:space="preserve"/>
       </w:r>
     </w:p>
     <w:p>
@@ -1934,22 +1962,25 @@
     <w:p/>
     <w:p>
       <w:r>
-        <w:t>1. Resistência 10M: liga a um fio HV output</w:t>
+        <w:t xml:space="preserve">O que precisas: Resistencia 10M Ohm, Resistencia 1M Ohm, fio de ligacao ao Arduino.
+Acao 1: Liga a resistencia de 10M Ohm diretamente a um dos fios de saida HV.
+Acao 2: Liga a resistencia de 1M Ohm em serie (do outro lado da resistencia de 10M ate ao outro fio HV).
+Acao 3: O ponto de juncao (onde as duas resistencias se encontram) conecta-se ao pino A0 do Arduino.</w:t>
       </w:r>
     </w:p>
     <w:p>
       <w:r>
-        <w:t>2. Resistência 1M: liga em serie (outro lado da 10M ate outro fio HV)</w:t>
+        <w:t xml:space="preserve">Verificacao: A tensao neste ponto = Tensao HV total / 11. Exemplo: 2.7V no teu multimetro = aproximadamente 30kV HV real.</w:t>
       </w:r>
     </w:p>
     <w:p>
       <w:r>
-        <w:t>3. Ponto intermedio → pino A0 Arduino</w:t>
+        <w:t xml:space="preserve"/>
       </w:r>
     </w:p>
     <w:p>
       <w:r>
-        <w:t>4. Tensao no ponto = Tensao HV / 11</w:t>
+        <w:t xml:space="preserve"/>
       </w:r>
     </w:p>
     <w:p>
@@ -2014,22 +2045,25 @@
     <w:p/>
     <w:p>
       <w:r>
-        <w:t>1. Fio nylon/corda (20-30cm) preso ao topo da estrutura</w:t>
+        <w:t xml:space="preserve">O que precisas: Fio de nylon (20-30cm), ponto de pivo (lapis, prego ou parafuso).
+Acao 1: Ata um pedaco de fio de nylon ou corda (20-30cm de comprimento) ao topo da estrutura do electrodo.
+Acao 2: Pendura toda a estrutura num ponto de pivo (um lapis atravessado entre duas mesas funciona bem).
+Acao 3: Confirma que o pendulo pode oscilar livremente num plano horizontal sem bater em nada.</w:t>
       </w:r>
     </w:p>
     <w:p>
       <w:r>
-        <w:t>2. Pendura em pivô (lapis entre duas mesas, ou prego)</w:t>
+        <w:t xml:space="preserve">Verificacao: Quando o HV for ligado, o electrodo vai deflectir em direccao ao collector. Esta deflexao e o que vais medir.</w:t>
       </w:r>
     </w:p>
     <w:p>
       <w:r>
-        <w:t>3. Pendulo deve oscilar livremente em plano horizontal</w:t>
+        <w:t xml:space="preserve"/>
       </w:r>
     </w:p>
     <w:p>
       <w:r>
-        <w:t>4. Electrodo deflecte para o collector quando HV ligado</w:t>
+        <w:t xml:space="preserve"/>
       </w:r>
     </w:p>
     <w:p>
@@ -2094,32 +2128,38 @@
     <w:p/>
     <w:p>
       <w:r>
-        <w:t>1. Sem HV, hanging pesos conhecidos (porcas M3 ~1.5g cada)</w:t>
+        <w:t xml:space="preserve">O que precisas: Pesos conhecidos (porcas M3, aproximadamente 1.5g cada).
+Acao 1: Com o HV DESLIGADO, hang pesos conhecidos no fio do pendulo um de cada vez.
+Acao 2: Mede a deflexao horizontal para cada peso. Regista os teus resultados:
+  - 0 peso = 0mm deflexao (linha de base)
+  - 1x porca M3 (~1.5g) = aproximadamente 3mm deflexao
+  - 5x porcas M3 (~7.5g) = aproximadamente 15mm deflexao
+Acao 3: Mantem esta tabela de calibracao. Vai usa-la para converter medicoes de deflexao em thrust (mN).</w:t>
       </w:r>
     </w:p>
     <w:p>
       <w:r>
-        <w:t>2. Mede deflexao para cada peso:</w:t>
+        <w:t xml:space="preserve">Dica: A deflexao exata depende do comprimento do teu fio. Mede o comprimento do fio e guarda-o para a formula de calculo.</w:t>
       </w:r>
     </w:p>
     <w:p>
       <w:r>
-        <w:t xml:space="preserve">   - 0 = 0mm</w:t>
+        <w:t xml:space="preserve"/>
       </w:r>
     </w:p>
     <w:p>
       <w:r>
-        <w:t xml:space="preserve">   - 1x porca M3 (~1.5g) = ~3mm</w:t>
+        <w:t xml:space="preserve"/>
       </w:r>
     </w:p>
     <w:p>
       <w:r>
-        <w:t xml:space="preserve">   - 5x porca M3 (~7.5g) = ~15mm</w:t>
+        <w:t xml:space="preserve"/>
       </w:r>
     </w:p>
     <w:p>
       <w:r>
-        <w:t>3. Guarda tabela para calcular thrust real</w:t>
+        <w:t xml:space="preserve"/>
       </w:r>
     </w:p>
     <w:p>
@@ -2184,57 +2224,68 @@
     <w:p/>
     <w:p>
       <w:r>
-        <w:t>1. Divisor ponto intermedio → A0 Arduino</w:t>
+        <w:t xml:space="preserve">O que precisas: Arduino Nano Every, cabo USB, fios do divisor de tensao.
+Acao 1: Liga o ponto de juncao do divisor de tensao ao pino A0 do Arduino.
+Acao 2: Liga o GND do Arduino ao GND do ZVS (isto cria uma referencia de terra comum).
+Acao 3: Liga o Arduino ao teu computador usando um cabo USB.
+Acao 4: Abre o Arduino IDE, seleciona a tua board, e abre o Serial Monitor a 9600 baud.</w:t>
       </w:r>
     </w:p>
     <w:p>
       <w:r>
-        <w:t>2. GND Arduino → GND ZVS (terra comum)</w:t>
+        <w:t xml:space="preserve">Codigo para carregar:
+void setup() { Serial.begin(9600); }
+void loop() {
+  int raw = analogRead(A0);
+  float kV = raw * 11.0 / 1023.0;
+  Serial.print("HV: "); Serial.print(kV, 1); Serial.println(" kV");
+  delay(500);
+}</w:t>
       </w:r>
     </w:p>
     <w:p>
       <w:r>
-        <w:t>3. Arduino → PC USB. Serial Monitor 9600 baud.</w:t>
+        <w:t xml:space="preserve"/>
       </w:r>
     </w:p>
     <w:p>
       <w:r>
-        <w:t>Codigo:</w:t>
+        <w:t xml:space="preserve"/>
       </w:r>
     </w:p>
     <w:p>
       <w:r>
-        <w:t>void setup(){Serial.begin(9600);}</w:t>
+        <w:t xml:space="preserve"/>
       </w:r>
     </w:p>
     <w:p>
       <w:r>
-        <w:t>void loop(){</w:t>
+        <w:t xml:space="preserve"/>
       </w:r>
     </w:p>
     <w:p>
       <w:r>
-        <w:t xml:space="preserve">  int raw=analogRead(A0);</w:t>
+        <w:t xml:space="preserve"/>
       </w:r>
     </w:p>
     <w:p>
       <w:r>
-        <w:t xml:space="preserve">  float kV=raw*11.0/1023.0;</w:t>
+        <w:t xml:space="preserve"/>
       </w:r>
     </w:p>
     <w:p>
       <w:r>
-        <w:t xml:space="preserve">  Serial.print("HV: ");Serial.print(kV,1);Serial.println(" kV");</w:t>
+        <w:t xml:space="preserve"/>
       </w:r>
     </w:p>
     <w:p>
       <w:r>
-        <w:t xml:space="preserve">  delay(500);</w:t>
+        <w:t xml:space="preserve"/>
       </w:r>
     </w:p>
     <w:p>
       <w:r>
-        <w:t>}</w:t>
+        <w:t xml:space="preserve"/>
       </w:r>
     </w:p>
     <w:p>
@@ -2299,27 +2350,31 @@
     <w:p/>
     <w:p>
       <w:r>
-        <w:t>1. Liga ZVS, aumenta tensao lentamente</w:t>
+        <w:t xml:space="preserve">Acao 1: Liga o modulo ZVS e aumenta lentamente a tensao.
+Acao 2: Observa o pendulo — deve comecar a deflectir em direccao ao collector.
+Acao 3: Regista o seguinte: tensao HV (kV), deflexao maxima (mm), e quaisquer sons ou cheiros inhabituais.
+Verificacao: CORONA (bom) = brilho violeta suave à volta do fio emitter, com quase nenhum som.</w:t>
       </w:r>
     </w:p>
     <w:p>
       <w:r>
-        <w:t>2. Observa pendulo — deflecte para o collector</w:t>
+        <w:t xml:space="preserve">ARCING (mau) = faíscas brilhantes brancas/azuis e um zumbido forte. Se isto acontecer, aumenta o gap imediatamente ou reduz a tensao.
+Seguranca: Nunca toques em nenhum componente enquanto o sistema estiver ligado. Mantem as maos pelo menos 10cm afastadas de todos os componentes HV.</w:t>
       </w:r>
     </w:p>
     <w:p>
       <w:r>
-        <w:t>3. Regista: tensao HV, deflexao maxima, algo estranho</w:t>
+        <w:t xml:space="preserve"/>
       </w:r>
     </w:p>
     <w:p>
       <w:r>
-        <w:t>4. CORONA = brilho violeta suave (bom)</w:t>
+        <w:t xml:space="preserve"/>
       </w:r>
     </w:p>
     <w:p>
       <w:r>
-        <w:t>5. ARKING = faíscas brancas/azuis = aumenta gap ou reduz tensao</w:t>
+        <w:t xml:space="preserve"/>
       </w:r>
     </w:p>
     <w:p>
@@ -2384,18 +2439,32 @@
     <w:p/>
     <w:p>
       <w:r>
-        <w:t>Formula: Thrust(mN) = (deflexao_mm/1000) x (peso_g x 9.81) x (L_gap/L_pendulum)</w:t>
-      </w:r>
-    </w:p>
-    <w:p/>
-    <w:p>
-      <w:r>
-        <w:t>Exemplo: L=250mm, deflexao=5mm, peso=50g:</w:t>
+        <w:t xml:space="preserve">Formula: Thrust (mN) = (deflexao_mm / 1000) x (peso_g x 9.81) x (L_gap / L_pendulo)
+Onde:
+  - deflexao_mm = deflexao horizontal medida em milimetros
+  - peso_g = peso total da estrutura oscilante em gramas
+  - L_gap = distancia do gap entre emitter e collector em milimetros (ex: 25mm)
+  - L_pendulo = comprimento do fio do pendulo em milimetros</w:t>
       </w:r>
     </w:p>
     <w:p>
       <w:r>
-        <w:t>Thrust = (5/1000)x(50x9.81)x(25/250) = 1.2 mN</w:t>
+        <w:t xml:space="preserve">Exemplo de calculo:
+  - Comprimento do fio do pendulo = 250mm
+  - Deflexao medida = 5mm
+  - Peso da estrutura = 50g
+  - Distancia do gap = 25mm
+  - Thrust = (5 / 1000) x (50 x 9.81) x (25 / 250) = 2.45 mN</w:t>
+      </w:r>
+    </w:p>
+    <w:p>
+      <w:r>
+        <w:t xml:space="preserve">Dica: Para maior precisao, usa a tabela de calibracao do Passo 10 para converter pesos conhecidos em medicoes de deflexao previstas.</w:t>
+      </w:r>
+    </w:p>
+    <w:p>
+      <w:r>
+        <w:t xml:space="preserve"/>
       </w:r>
     </w:p>
     <w:p>

</xml_diff>

<commit_message>
Add Carlos reference image to both guide versions
</commit_message>
<xml_diff>
--- a/ion-wind-plane/Thrust_Stand_Guide_PT_v6.docx
+++ b/ion-wind-plane/Thrust_Stand_Guide_PT_v6.docx
@@ -2468,6 +2468,14 @@
       </w:r>
     </w:p>
     <w:p>
+      <w:r>
+        <w:rPr>
+          <w:b/>
+        </w:rPr>
+        <w:t xml:space="preserve">Referencia — Thrust Stand Montado (Opcao A)</w:t>
+      </w:r>
+    </w:p>
+    <w:p>
       <w:pPr>
         <w:pStyle w:val="Heading1"/>
       </w:pPr>

</xml_diff>